<commit_message>
ERD and Normalization documentation complete.
</commit_message>
<xml_diff>
--- a/MealSuggesterDocumentation.docx
+++ b/MealSuggesterDocumentation.docx
@@ -85,13 +85,8 @@
         </w:numPr>
       </w:pPr>
       <w:r>
-        <w:t xml:space="preserve">Purpose = </w:t>
-      </w:r>
-      <w:proofErr w:type="spellStart"/>
-      <w:r>
-        <w:t>Orienteation</w:t>
-      </w:r>
-      <w:proofErr w:type="spellEnd"/>
+        <w:t>Purpose = Orientation</w:t>
+      </w:r>
     </w:p>
     <w:p>
       <w:pPr>
@@ -116,11 +111,9 @@
       <w:r>
         <w:t xml:space="preserve">Nav options: </w:t>
       </w:r>
-      <w:proofErr w:type="spellStart"/>
-      <w:r>
-        <w:t>Insipre</w:t>
-      </w:r>
-      <w:proofErr w:type="spellEnd"/>
+      <w:r>
+        <w:t>Inspire</w:t>
+      </w:r>
       <w:r>
         <w:t xml:space="preserve"> Me &amp; Find a Meal</w:t>
       </w:r>
@@ -758,7 +751,6 @@
         <w:t>)</w:t>
       </w:r>
     </w:p>
-    <w:p/>
     <w:p>
       <w:r>
         <w:tab/>
@@ -790,6 +782,83 @@
         <w:t>)</w:t>
       </w:r>
     </w:p>
+    <w:p>
+      <w:r>
+        <w:tab/>
+      </w:r>
+    </w:p>
+    <w:p>
+      <w:r>
+        <w:tab/>
+      </w:r>
+      <w:r>
+        <w:tab/>
+      </w:r>
+      <w:r>
+        <w:t xml:space="preserve">Meal </w:t>
+      </w:r>
+      <w:r>
+        <w:sym w:font="Wingdings" w:char="F0DF"/>
+      </w:r>
+      <w:r>
+        <w:t xml:space="preserve"> </w:t>
+      </w:r>
+      <w:r>
+        <w:sym w:font="Wingdings" w:char="F0E0"/>
+      </w:r>
+      <w:r>
+        <w:t xml:space="preserve"> </w:t>
+      </w:r>
+      <w:proofErr w:type="spellStart"/>
+      <w:r>
+        <w:t>MealType</w:t>
+      </w:r>
+      <w:proofErr w:type="spellEnd"/>
+      <w:r>
+        <w:t xml:space="preserve"> </w:t>
+      </w:r>
+      <w:r>
+        <w:t xml:space="preserve">--- Many to </w:t>
+      </w:r>
+      <w:r>
+        <w:t>Many</w:t>
+      </w:r>
+      <w:r>
+        <w:t xml:space="preserve"> Relationship</w:t>
+      </w:r>
+    </w:p>
+    <w:p>
+      <w:r>
+        <w:tab/>
+      </w:r>
+      <w:proofErr w:type="spellStart"/>
+      <w:r>
+        <w:t>MealType</w:t>
+      </w:r>
+      <w:proofErr w:type="spellEnd"/>
+    </w:p>
+    <w:p>
+      <w:r>
+        <w:tab/>
+        <w:t xml:space="preserve">    (</w:t>
+      </w:r>
+      <w:proofErr w:type="spellStart"/>
+      <w:r>
+        <w:t>MealTypeId</w:t>
+      </w:r>
+      <w:proofErr w:type="spellEnd"/>
+      <w:r>
+        <w:t xml:space="preserve"> (PK) </w:t>
+      </w:r>
+      <w:proofErr w:type="spellStart"/>
+      <w:r>
+        <w:t>MealTypeName</w:t>
+      </w:r>
+      <w:proofErr w:type="spellEnd"/>
+      <w:r>
+        <w:t>)</w:t>
+      </w:r>
+    </w:p>
     <w:p/>
     <w:p>
       <w:r>
@@ -941,6 +1010,7 @@
     </w:p>
     <w:p>
       <w:r>
+        <w:lastRenderedPageBreak/>
         <w:tab/>
         <w:t xml:space="preserve">     (</w:t>
       </w:r>
@@ -980,7 +1050,6 @@
     <w:p/>
     <w:p>
       <w:r>
-        <w:lastRenderedPageBreak/>
         <w:t>3NF</w:t>
       </w:r>
       <w:r>
@@ -1180,31 +1249,6 @@
       <w:r>
         <w:tab/>
       </w:r>
-    </w:p>
-    <w:p>
-      <w:r>
-        <w:tab/>
-      </w:r>
-      <w:r>
-        <w:tab/>
-      </w:r>
-      <w:proofErr w:type="spellStart"/>
-      <w:r>
-        <w:t>MealIngredients</w:t>
-      </w:r>
-      <w:proofErr w:type="spellEnd"/>
-      <w:r>
-        <w:t xml:space="preserve"> </w:t>
-      </w:r>
-      <w:r>
-        <w:sym w:font="Wingdings" w:char="F0DF"/>
-      </w:r>
-      <w:r>
-        <w:sym w:font="Wingdings" w:char="F0E0"/>
-      </w:r>
-      <w:r>
-        <w:t xml:space="preserve"> Meal --- Many to Many Relationship</w:t>
-      </w:r>
       <w:r>
         <w:tab/>
       </w:r>
@@ -1216,13 +1260,8 @@
       <w:pPr>
         <w:ind w:left="720" w:firstLine="720"/>
       </w:pPr>
-      <w:proofErr w:type="spellStart"/>
-      <w:r>
-        <w:t>MealIngredients</w:t>
-      </w:r>
-      <w:proofErr w:type="spellEnd"/>
-      <w:r>
-        <w:t xml:space="preserve"> </w:t>
+      <w:r>
+        <w:t xml:space="preserve">Meal </w:t>
       </w:r>
       <w:r>
         <w:sym w:font="Wingdings" w:char="F0DF"/>
@@ -1299,11 +1338,113 @@
         <w:t>)</w:t>
       </w:r>
     </w:p>
+    <w:p/>
+    <w:p>
+      <w:pPr>
+        <w:ind w:firstLine="720"/>
+      </w:pPr>
+      <w:proofErr w:type="spellStart"/>
+      <w:r>
+        <w:t>MealType</w:t>
+      </w:r>
+      <w:proofErr w:type="spellEnd"/>
+    </w:p>
+    <w:p>
+      <w:r>
+        <w:tab/>
+        <w:t xml:space="preserve">     (</w:t>
+      </w:r>
+      <w:proofErr w:type="spellStart"/>
+      <w:r>
+        <w:rPr>
+          <w:u w:val="single"/>
+        </w:rPr>
+        <w:t>MealTypeId</w:t>
+      </w:r>
+      <w:proofErr w:type="spellEnd"/>
+      <w:r>
+        <w:t xml:space="preserve"> </w:t>
+      </w:r>
+      <w:proofErr w:type="spellStart"/>
+      <w:r>
+        <w:t>MealTypeName</w:t>
+      </w:r>
+      <w:proofErr w:type="spellEnd"/>
+      <w:r>
+        <w:t>)</w:t>
+      </w:r>
+    </w:p>
     <w:p>
       <w:pPr>
         <w:ind w:left="720" w:firstLine="720"/>
       </w:pPr>
       <w:r>
+        <w:t xml:space="preserve">Meal </w:t>
+      </w:r>
+      <w:r>
+        <w:sym w:font="Wingdings" w:char="F0DF"/>
+      </w:r>
+      <w:r>
+        <w:sym w:font="Wingdings" w:char="F0E0"/>
+      </w:r>
+      <w:r>
+        <w:t xml:space="preserve"> </w:t>
+      </w:r>
+      <w:proofErr w:type="spellStart"/>
+      <w:r>
+        <w:t>MealType</w:t>
+      </w:r>
+      <w:proofErr w:type="spellEnd"/>
+      <w:r>
+        <w:t xml:space="preserve"> --- Many to Many Relationship</w:t>
+      </w:r>
+    </w:p>
+    <w:p>
+      <w:pPr>
+        <w:ind w:firstLine="720"/>
+      </w:pPr>
+      <w:proofErr w:type="spellStart"/>
+      <w:r>
+        <w:t>Meal</w:t>
+      </w:r>
+      <w:r>
+        <w:t>Type</w:t>
+      </w:r>
+      <w:r>
+        <w:t>Assignment</w:t>
+      </w:r>
+      <w:proofErr w:type="spellEnd"/>
+    </w:p>
+    <w:p>
+      <w:r>
+        <w:tab/>
+        <w:t xml:space="preserve">     (</w:t>
+      </w:r>
+      <w:proofErr w:type="spellStart"/>
+      <w:r>
+        <w:t>MealId</w:t>
+      </w:r>
+      <w:proofErr w:type="spellEnd"/>
+      <w:r>
+        <w:t xml:space="preserve"> (FK) </w:t>
+      </w:r>
+      <w:proofErr w:type="spellStart"/>
+      <w:r>
+        <w:t>MealType</w:t>
+      </w:r>
+      <w:r>
+        <w:t>Id</w:t>
+      </w:r>
+      <w:proofErr w:type="spellEnd"/>
+      <w:r>
+        <w:t xml:space="preserve"> (FK))</w:t>
+      </w:r>
+    </w:p>
+    <w:p>
+      <w:pPr>
+        <w:ind w:left="720" w:firstLine="720"/>
+      </w:pPr>
+      <w:r>
         <w:br/>
       </w:r>
       <w:proofErr w:type="spellStart"/>
@@ -1314,6 +1455,7 @@
     </w:p>
     <w:p>
       <w:r>
+        <w:lastRenderedPageBreak/>
         <w:tab/>
         <w:t xml:space="preserve">     (</w:t>
       </w:r>
@@ -1425,7 +1567,53 @@
       </w:r>
     </w:p>
     <w:p/>
-    <w:p/>
+    <w:p>
+      <w:r>
+        <w:t>Joining Tables used to resolve Many-To-Many Relationships:</w:t>
+      </w:r>
+    </w:p>
+    <w:p>
+      <w:pPr>
+        <w:pStyle w:val="ListParagraph"/>
+        <w:numPr>
+          <w:ilvl w:val="0"/>
+          <w:numId w:val="4"/>
+        </w:numPr>
+      </w:pPr>
+      <w:proofErr w:type="spellStart"/>
+      <w:r>
+        <w:t>MealIngredients</w:t>
+      </w:r>
+      <w:proofErr w:type="spellEnd"/>
+    </w:p>
+    <w:p>
+      <w:pPr>
+        <w:pStyle w:val="ListParagraph"/>
+        <w:numPr>
+          <w:ilvl w:val="0"/>
+          <w:numId w:val="4"/>
+        </w:numPr>
+      </w:pPr>
+      <w:proofErr w:type="spellStart"/>
+      <w:r>
+        <w:t>MealTypeAssignment</w:t>
+      </w:r>
+      <w:proofErr w:type="spellEnd"/>
+    </w:p>
+    <w:p>
+      <w:pPr>
+        <w:pStyle w:val="ListParagraph"/>
+        <w:numPr>
+          <w:ilvl w:val="0"/>
+          <w:numId w:val="4"/>
+        </w:numPr>
+      </w:pPr>
+      <w:proofErr w:type="spellStart"/>
+      <w:r>
+        <w:t>MealDietaryTag</w:t>
+      </w:r>
+      <w:proofErr w:type="spellEnd"/>
+    </w:p>
     <w:sectPr>
       <w:pgSz w:w="12240" w:h="15840"/>
       <w:pgMar w:top="1440" w:right="1440" w:bottom="1440" w:left="1440" w:header="708" w:footer="708" w:gutter="0"/>

</xml_diff>

<commit_message>
Added ERD as pdf file, jpg file (image), and added to documentation to display the final ERD created.
</commit_message>
<xml_diff>
--- a/MealSuggesterDocumentation.docx
+++ b/MealSuggesterDocumentation.docx
@@ -1614,6 +1614,67 @@
       </w:r>
       <w:proofErr w:type="spellEnd"/>
     </w:p>
+    <w:p/>
+    <w:p>
+      <w:r>
+        <w:rPr>
+          <w:noProof/>
+        </w:rPr>
+        <w:drawing>
+          <wp:anchor distT="0" distB="0" distL="114300" distR="114300" simplePos="0" relativeHeight="251658240" behindDoc="0" locked="0" layoutInCell="1" allowOverlap="1" wp14:anchorId="31F605EC" wp14:editId="20CD0FF6">
+            <wp:simplePos x="0" y="0"/>
+            <wp:positionH relativeFrom="page">
+              <wp:posOffset>396815</wp:posOffset>
+            </wp:positionH>
+            <wp:positionV relativeFrom="paragraph">
+              <wp:posOffset>319920</wp:posOffset>
+            </wp:positionV>
+            <wp:extent cx="7008339" cy="4847434"/>
+            <wp:effectExtent l="0" t="0" r="2540" b="0"/>
+            <wp:wrapSquare wrapText="bothSides"/>
+            <wp:docPr id="487021989" name="Picture 3"/>
+            <wp:cNvGraphicFramePr>
+              <a:graphicFrameLocks xmlns:a="http://schemas.openxmlformats.org/drawingml/2006/main" noChangeAspect="1"/>
+            </wp:cNvGraphicFramePr>
+            <a:graphic xmlns:a="http://schemas.openxmlformats.org/drawingml/2006/main">
+              <a:graphicData uri="http://schemas.openxmlformats.org/drawingml/2006/picture">
+                <pic:pic xmlns:pic="http://schemas.openxmlformats.org/drawingml/2006/picture">
+                  <pic:nvPicPr>
+                    <pic:cNvPr id="487021989" name="Picture 487021989"/>
+                    <pic:cNvPicPr/>
+                  </pic:nvPicPr>
+                  <pic:blipFill>
+                    <a:blip r:embed="rId5">
+                      <a:extLst>
+                        <a:ext uri="{28A0092B-C50C-407E-A947-70E740481C1C}">
+                          <a14:useLocalDpi xmlns:a14="http://schemas.microsoft.com/office/drawing/2010/main" val="0"/>
+                        </a:ext>
+                      </a:extLst>
+                    </a:blip>
+                    <a:stretch>
+                      <a:fillRect/>
+                    </a:stretch>
+                  </pic:blipFill>
+                  <pic:spPr>
+                    <a:xfrm>
+                      <a:off x="0" y="0"/>
+                      <a:ext cx="7008339" cy="4847434"/>
+                    </a:xfrm>
+                    <a:prstGeom prst="rect">
+                      <a:avLst/>
+                    </a:prstGeom>
+                  </pic:spPr>
+                </pic:pic>
+              </a:graphicData>
+            </a:graphic>
+          </wp:anchor>
+        </w:drawing>
+      </w:r>
+      <w:r>
+        <w:t>Completed Entity Relationship Diagram (ERD)</w:t>
+      </w:r>
+    </w:p>
+    <w:p/>
     <w:sectPr>
       <w:pgSz w:w="12240" w:h="15840"/>
       <w:pgMar w:top="1440" w:right="1440" w:bottom="1440" w:left="1440" w:header="708" w:footer="708" w:gutter="0"/>

</xml_diff>